<commit_message>
docs: HDSD yeu cau bao gia - cap nhat sau khi sua loi trinh duyet
Co-Authored-By: Claude Opus 5.5 <noreply@anthropic.com>
</commit_message>
<xml_diff>
--- a/docs/HDSD-yeu-cau-bao-gia.docx
+++ b/docs/HDSD-yeu-cau-bao-gia.docx
@@ -350,6 +350,53 @@
                 <w:i w:val="0"/>
               </w:rPr>
               <w:t>Những việc hệ thống cố ý không làm</w:t>
+            </w:r>
+          </w:p>
+        </w:tc>
+      </w:tr>
+      <w:tr>
+        <w:tc>
+          <w:tcPr>
+            <w:tcW w:type="dxa" w:w="2880"/>
+          </w:tcPr>
+          <w:p>
+            <w:r/>
+            <w:r>
+              <w:rPr>
+                <w:b/>
+                <w:i w:val="0"/>
+              </w:rPr>
+              <w:t>F</w:t>
+            </w:r>
+          </w:p>
+        </w:tc>
+        <w:tc>
+          <w:tcPr>
+            <w:tcW w:type="dxa" w:w="2880"/>
+          </w:tcPr>
+          <w:p>
+            <w:r/>
+            <w:r>
+              <w:rPr>
+                <w:b w:val="0"/>
+                <w:i w:val="0"/>
+              </w:rPr>
+              <w:t>Quản trị hệ thống của Miyano</w:t>
+            </w:r>
+          </w:p>
+        </w:tc>
+        <w:tc>
+          <w:tcPr>
+            <w:tcW w:type="dxa" w:w="2880"/>
+          </w:tcPr>
+          <w:p>
+            <w:r/>
+            <w:r>
+              <w:rPr>
+                <w:b w:val="0"/>
+                <w:i w:val="0"/>
+              </w:rPr>
+              <w:t>Việc phải làm sau khi cập nhật hệ thống</w:t>
             </w:r>
           </w:p>
         </w:tc>
@@ -2402,7 +2449,7 @@
           <w:b w:val="0"/>
           <w:i w:val="0"/>
         </w:rPr>
-        <w:t>. Bấm thẻ để tới thẳng nhóm "Chờ anh/chị đồng ý".</w:t>
+        <w:t>. Bấm thẻ để tới thẳng nhóm "Chờ anh/chị đồng ý". Nếu đơn vị còn đơn chờ báo giá của cách làm cũ, ngay dưới thẻ có dòng nhỏ "… đơn cũ chờ đồng ý →" dẫn tới các đơn đó ở tab Đơn hàng.</w:t>
       </w:r>
     </w:p>
     <w:p>
@@ -3767,21 +3814,49 @@
           <w:b w:val="0"/>
           <w:i w:val="0"/>
         </w:rPr>
-        <w:t xml:space="preserve">Giá vừa đồng ý được ghi vào Bảng giá của đơn vị. Lần sau các mặt hàng đó hiện </w:t>
+        <w:t xml:space="preserve">Mở đơn sẽ thấy </w:t>
       </w:r>
       <w:r>
         <w:rPr>
           <w:b/>
           <w:i w:val="0"/>
         </w:rPr>
-        <w:t>Bảng giá … ₫</w:t>
+        <w:t>đủ mọi mặt hàng của báo giá</w:t>
       </w:r>
       <w:r>
         <w:rPr>
           <w:b w:val="0"/>
           <w:i w:val="0"/>
         </w:rPr>
-        <w:t xml:space="preserve"> trên màn chọn hàng và đặt ngay được.</w:t>
+        <w:t xml:space="preserve">. Mặt hàng vốn là hàng tự khai mang nhãn </w:t>
+      </w:r>
+      <w:r>
+        <w:rPr>
+          <w:b/>
+          <w:i w:val="0"/>
+        </w:rPr>
+        <w:t>Đã khớp với yêu cầu</w:t>
+      </w:r>
+      <w:r>
+        <w:rPr>
+          <w:b w:val="0"/>
+          <w:i w:val="0"/>
+        </w:rPr>
+        <w:t xml:space="preserve">; bấm </w:t>
+      </w:r>
+      <w:r>
+        <w:rPr>
+          <w:b/>
+          <w:i w:val="0"/>
+        </w:rPr>
+        <w:t>Xem chi tiết</w:t>
+      </w:r>
+      <w:r>
+        <w:rPr>
+          <w:b w:val="0"/>
+          <w:i w:val="0"/>
+        </w:rPr>
+        <w:t xml:space="preserve"> ngay dưới nhãn để xem lại đúng mô tả đơn vị đã khai lúc gửi. Dòng này hiện "—" ở cột SL DUYỆT; số lượng đặt là số ở cột SL ĐẶT.</w:t>
       </w:r>
     </w:p>
     <w:p>
@@ -3791,7 +3866,7 @@
       <w:r>
         <w:drawing>
           <wp:inline xmlns:a="http://schemas.openxmlformats.org/drawingml/2006/main" xmlns:pic="http://schemas.openxmlformats.org/drawingml/2006/picture">
-            <wp:extent cx="5486400" cy="2222938"/>
+            <wp:extent cx="5486400" cy="4204663"/>
             <wp:docPr id="18" name="Picture 18"/>
             <wp:cNvGraphicFramePr>
               <a:graphicFrameLocks noChangeAspect="1"/>
@@ -3800,11 +3875,88 @@
               <a:graphicData uri="http://schemas.openxmlformats.org/drawingml/2006/picture">
                 <pic:pic>
                   <pic:nvPicPr>
-                    <pic:cNvPr id="0" name="18-gia-moi-tren-danh-muc.png"/>
+                    <pic:cNvPr id="0" name="18-don-du-mat-hang.png"/>
                     <pic:cNvPicPr/>
                   </pic:nvPicPr>
                   <pic:blipFill>
                     <a:blip r:embed="rId26"/>
+                    <a:stretch>
+                      <a:fillRect/>
+                    </a:stretch>
+                  </pic:blipFill>
+                  <pic:spPr>
+                    <a:xfrm>
+                      <a:off x="0" y="0"/>
+                      <a:ext cx="5486400" cy="4204663"/>
+                    </a:xfrm>
+                    <a:prstGeom prst="rect"/>
+                  </pic:spPr>
+                </pic:pic>
+              </a:graphicData>
+            </a:graphic>
+          </wp:inline>
+        </w:drawing>
+      </w:r>
+    </w:p>
+    <w:p>
+      <w:pPr>
+        <w:jc w:val="center"/>
+      </w:pPr>
+      <w:r>
+        <w:rPr>
+          <w:b w:val="0"/>
+          <w:i/>
+        </w:rPr>
+        <w:t>Hình 18 – Chi tiết đơn sinh từ báo giá: đủ hai mặt hàng, dòng thứ hai mang nhãn "Đã khớp với yêu cầu" và mô tả đã khai</w:t>
+      </w:r>
+    </w:p>
+    <w:p>
+      <w:pPr>
+        <w:pStyle w:val="ListBullet"/>
+      </w:pPr>
+      <w:r>
+        <w:rPr>
+          <w:b w:val="0"/>
+          <w:i w:val="0"/>
+        </w:rPr>
+        <w:t xml:space="preserve">Giá vừa đồng ý được ghi vào Bảng giá của đơn vị. Lần sau các mặt hàng đó hiện </w:t>
+      </w:r>
+      <w:r>
+        <w:rPr>
+          <w:b/>
+          <w:i w:val="0"/>
+        </w:rPr>
+        <w:t>Bảng giá … ₫</w:t>
+      </w:r>
+      <w:r>
+        <w:rPr>
+          <w:b w:val="0"/>
+          <w:i w:val="0"/>
+        </w:rPr>
+        <w:t xml:space="preserve"> trên màn chọn hàng và đặt ngay được.</w:t>
+      </w:r>
+    </w:p>
+    <w:p>
+      <w:pPr>
+        <w:jc w:val="center"/>
+      </w:pPr>
+      <w:r>
+        <w:drawing>
+          <wp:inline xmlns:a="http://schemas.openxmlformats.org/drawingml/2006/main" xmlns:pic="http://schemas.openxmlformats.org/drawingml/2006/picture">
+            <wp:extent cx="5486400" cy="2222938"/>
+            <wp:docPr id="19" name="Picture 19"/>
+            <wp:cNvGraphicFramePr>
+              <a:graphicFrameLocks noChangeAspect="1"/>
+            </wp:cNvGraphicFramePr>
+            <a:graphic>
+              <a:graphicData uri="http://schemas.openxmlformats.org/drawingml/2006/picture">
+                <pic:pic>
+                  <pic:nvPicPr>
+                    <pic:cNvPr id="0" name="19-gia-moi-tren-danh-muc.png"/>
+                    <pic:cNvPicPr/>
+                  </pic:nvPicPr>
+                  <pic:blipFill>
+                    <a:blip r:embed="rId27"/>
                     <a:stretch>
                       <a:fillRect/>
                     </a:stretch>
@@ -3832,7 +3984,7 @@
           <w:b w:val="0"/>
           <w:i/>
         </w:rPr>
-        <w:t>Hình 18 – Mặt hàng vừa được báo giá nay hiện "Bảng giá 98.000 ₫"</w:t>
+        <w:t>Hình 19 – Mặt hàng vừa được báo giá nay hiện "Bảng giá 98.000 ₫"</w:t>
       </w:r>
     </w:p>
     <w:p>
@@ -3931,7 +4083,7 @@
         <w:drawing>
           <wp:inline xmlns:a="http://schemas.openxmlformats.org/drawingml/2006/main" xmlns:pic="http://schemas.openxmlformats.org/drawingml/2006/picture">
             <wp:extent cx="5486400" cy="2081048"/>
-            <wp:docPr id="19" name="Picture 19"/>
+            <wp:docPr id="20" name="Picture 20"/>
             <wp:cNvGraphicFramePr>
               <a:graphicFrameLocks noChangeAspect="1"/>
             </wp:cNvGraphicFramePr>
@@ -3939,11 +4091,11 @@
               <a:graphicData uri="http://schemas.openxmlformats.org/drawingml/2006/picture">
                 <pic:pic>
                   <pic:nvPicPr>
-                    <pic:cNvPr id="0" name="19-bao-gia-het-han.png"/>
+                    <pic:cNvPr id="0" name="20-bao-gia-het-han.png"/>
                     <pic:cNvPicPr/>
                   </pic:nvPicPr>
                   <pic:blipFill>
-                    <a:blip r:embed="rId27"/>
+                    <a:blip r:embed="rId28"/>
                     <a:stretch>
                       <a:fillRect/>
                     </a:stretch>
@@ -3971,7 +4123,7 @@
           <w:b w:val="0"/>
           <w:i/>
         </w:rPr>
-        <w:t>Hình 19 – Báo giá hết hạn: nhãn "Đã đóng" và dòng báo quá hạn</w:t>
+        <w:t>Hình 20 – Báo giá hết hạn: nhãn "Đã đóng" và dòng báo quá hạn</w:t>
       </w:r>
     </w:p>
     <w:p>
@@ -4026,7 +4178,7 @@
         <w:drawing>
           <wp:inline xmlns:a="http://schemas.openxmlformats.org/drawingml/2006/main" xmlns:pic="http://schemas.openxmlformats.org/drawingml/2006/picture">
             <wp:extent cx="5486400" cy="1182414"/>
-            <wp:docPr id="20" name="Picture 20"/>
+            <wp:docPr id="21" name="Picture 21"/>
             <wp:cNvGraphicFramePr>
               <a:graphicFrameLocks noChangeAspect="1"/>
             </wp:cNvGraphicFramePr>
@@ -4034,11 +4186,11 @@
               <a:graphicData uri="http://schemas.openxmlformats.org/drawingml/2006/picture">
                 <pic:pic>
                   <pic:nvPicPr>
-                    <pic:cNvPr id="0" name="20-thong-bao-miyano-tu-choi.png"/>
+                    <pic:cNvPr id="0" name="21-thong-bao-miyano-tu-choi.png"/>
                     <pic:cNvPicPr/>
                   </pic:nvPicPr>
                   <pic:blipFill>
-                    <a:blip r:embed="rId28"/>
+                    <a:blip r:embed="rId29"/>
                     <a:stretch>
                       <a:fillRect/>
                     </a:stretch>
@@ -4066,7 +4218,7 @@
           <w:b w:val="0"/>
           <w:i/>
         </w:rPr>
-        <w:t>Hình 20 – Thông báo Miyano từ chối, kèm lý do</w:t>
+        <w:t>Hình 21 – Thông báo Miyano từ chối, kèm lý do</w:t>
       </w:r>
     </w:p>
     <w:p>
@@ -4440,7 +4592,7 @@
         <w:drawing>
           <wp:inline xmlns:a="http://schemas.openxmlformats.org/drawingml/2006/main" xmlns:pic="http://schemas.openxmlformats.org/drawingml/2006/picture">
             <wp:extent cx="5486400" cy="3878317"/>
-            <wp:docPr id="21" name="Picture 21"/>
+            <wp:docPr id="22" name="Picture 22"/>
             <wp:cNvGraphicFramePr>
               <a:graphicFrameLocks noChangeAspect="1"/>
             </wp:cNvGraphicFramePr>
@@ -4448,11 +4600,11 @@
               <a:graphicData uri="http://schemas.openxmlformats.org/drawingml/2006/picture">
                 <pic:pic>
                   <pic:nvPicPr>
-                    <pic:cNvPr id="0" name="21-gio-nhan-vien-khoa.png"/>
+                    <pic:cNvPr id="0" name="22-gio-nhan-vien-khoa.png"/>
                     <pic:cNvPicPr/>
                   </pic:nvPicPr>
                   <pic:blipFill>
-                    <a:blip r:embed="rId29"/>
+                    <a:blip r:embed="rId30"/>
                     <a:stretch>
                       <a:fillRect/>
                     </a:stretch>
@@ -4480,7 +4632,7 @@
           <w:b w:val="0"/>
           <w:i/>
         </w:rPr>
-        <w:t>Hình 21 – Giỏ của nhân viên khoa: ô "Lý do yêu cầu", nút "Gửi duyệt"</w:t>
+        <w:t>Hình 22 – Giỏ của nhân viên khoa: ô "Lý do yêu cầu", nút "Gửi duyệt"</w:t>
       </w:r>
     </w:p>
     <w:p>
@@ -4572,7 +4724,7 @@
         <w:drawing>
           <wp:inline xmlns:a="http://schemas.openxmlformats.org/drawingml/2006/main" xmlns:pic="http://schemas.openxmlformats.org/drawingml/2006/picture">
             <wp:extent cx="5486400" cy="1855114"/>
-            <wp:docPr id="22" name="Picture 22"/>
+            <wp:docPr id="23" name="Picture 23"/>
             <wp:cNvGraphicFramePr>
               <a:graphicFrameLocks noChangeAspect="1"/>
             </wp:cNvGraphicFramePr>
@@ -4580,11 +4732,11 @@
               <a:graphicData uri="http://schemas.openxmlformats.org/drawingml/2006/picture">
                 <pic:pic>
                   <pic:nvPicPr>
-                    <pic:cNvPr id="0" name="22-quan-ly-cho-duyet.png"/>
+                    <pic:cNvPr id="0" name="23-quan-ly-cho-duyet.png"/>
                     <pic:cNvPicPr/>
                   </pic:nvPicPr>
                   <pic:blipFill>
-                    <a:blip r:embed="rId30"/>
+                    <a:blip r:embed="rId31"/>
                     <a:stretch>
                       <a:fillRect/>
                     </a:stretch>
@@ -4612,7 +4764,7 @@
           <w:b w:val="0"/>
           <w:i/>
         </w:rPr>
-        <w:t>Hình 22 – Hàng chờ duyệt của quản lý: phiếu yêu cầu báo giá của khoa Huyết học ở dòng đầu</w:t>
+        <w:t>Hình 23 – Hàng chờ duyệt của quản lý: phiếu yêu cầu báo giá của khoa Huyết học ở dòng đầu</w:t>
       </w:r>
     </w:p>
     <w:p>
@@ -4688,7 +4840,7 @@
         <w:drawing>
           <wp:inline xmlns:a="http://schemas.openxmlformats.org/drawingml/2006/main" xmlns:pic="http://schemas.openxmlformats.org/drawingml/2006/picture">
             <wp:extent cx="5486400" cy="2459421"/>
-            <wp:docPr id="23" name="Picture 23"/>
+            <wp:docPr id="24" name="Picture 24"/>
             <wp:cNvGraphicFramePr>
               <a:graphicFrameLocks noChangeAspect="1"/>
             </wp:cNvGraphicFramePr>
@@ -4696,11 +4848,11 @@
               <a:graphicData uri="http://schemas.openxmlformats.org/drawingml/2006/picture">
                 <pic:pic>
                   <pic:nvPicPr>
-                    <pic:cNvPr id="0" name="23-quan-ly-mo-phieu.png"/>
+                    <pic:cNvPr id="0" name="24-quan-ly-mo-phieu.png"/>
                     <pic:cNvPicPr/>
                   </pic:nvPicPr>
                   <pic:blipFill>
-                    <a:blip r:embed="rId31"/>
+                    <a:blip r:embed="rId32"/>
                     <a:stretch>
                       <a:fillRect/>
                     </a:stretch>
@@ -4728,7 +4880,7 @@
           <w:b w:val="0"/>
           <w:i/>
         </w:rPr>
-        <w:t>Hình 23 – Quản lý mở phiếu của khoa: các nút Duyệt, Từ chối, Huỷ phiếu</w:t>
+        <w:t>Hình 24 – Quản lý mở phiếu của khoa: các nút Duyệt, Từ chối, Huỷ phiếu</w:t>
       </w:r>
     </w:p>
     <w:p>
@@ -4762,7 +4914,7 @@
         <w:drawing>
           <wp:inline xmlns:a="http://schemas.openxmlformats.org/drawingml/2006/main" xmlns:pic="http://schemas.openxmlformats.org/drawingml/2006/picture">
             <wp:extent cx="5486400" cy="1891862"/>
-            <wp:docPr id="24" name="Picture 24"/>
+            <wp:docPr id="25" name="Picture 25"/>
             <wp:cNvGraphicFramePr>
               <a:graphicFrameLocks noChangeAspect="1"/>
             </wp:cNvGraphicFramePr>
@@ -4770,11 +4922,11 @@
               <a:graphicData uri="http://schemas.openxmlformats.org/drawingml/2006/picture">
                 <pic:pic>
                   <pic:nvPicPr>
-                    <pic:cNvPr id="0" name="24-sau-duyet.png"/>
+                    <pic:cNvPr id="0" name="25-sau-duyet.png"/>
                     <pic:cNvPicPr/>
                   </pic:nvPicPr>
                   <pic:blipFill>
-                    <a:blip r:embed="rId32"/>
+                    <a:blip r:embed="rId33"/>
                     <a:stretch>
                       <a:fillRect/>
                     </a:stretch>
@@ -4802,7 +4954,7 @@
           <w:b w:val="0"/>
           <w:i/>
         </w:rPr>
-        <w:t>Hình 24 – Sau khi duyệt: phiếu "Đã duyệt", có đường dẫn sang yêu cầu báo giá</w:t>
+        <w:t>Hình 25 – Sau khi duyệt: phiếu "Đã duyệt", có đường dẫn sang yêu cầu báo giá</w:t>
       </w:r>
     </w:p>
     <w:p>
@@ -4850,7 +5002,7 @@
         <w:drawing>
           <wp:inline xmlns:a="http://schemas.openxmlformats.org/drawingml/2006/main" xmlns:pic="http://schemas.openxmlformats.org/drawingml/2006/picture">
             <wp:extent cx="5486400" cy="2210348"/>
-            <wp:docPr id="25" name="Picture 25"/>
+            <wp:docPr id="26" name="Picture 26"/>
             <wp:cNvGraphicFramePr>
               <a:graphicFrameLocks noChangeAspect="1"/>
             </wp:cNvGraphicFramePr>
@@ -4858,11 +5010,11 @@
               <a:graphicData uri="http://schemas.openxmlformats.org/drawingml/2006/picture">
                 <pic:pic>
                   <pic:nvPicPr>
-                    <pic:cNvPr id="0" name="25-nhan-vien-khoa-xem-bao-gia.png"/>
+                    <pic:cNvPr id="0" name="26-nhan-vien-khoa-xem-bao-gia.png"/>
                     <pic:cNvPicPr/>
                   </pic:nvPicPr>
                   <pic:blipFill>
-                    <a:blip r:embed="rId33"/>
+                    <a:blip r:embed="rId34"/>
                     <a:stretch>
                       <a:fillRect/>
                     </a:stretch>
@@ -4890,7 +5042,7 @@
           <w:b w:val="0"/>
           <w:i/>
         </w:rPr>
-        <w:t>Hình 25 – Nhân viên khoa xem báo giá: có Đồng ý và Từ chối, không có Sửa số lượng</w:t>
+        <w:t>Hình 26 – Nhân viên khoa xem báo giá: có Đồng ý và Từ chối, không có Sửa số lượng</w:t>
       </w:r>
     </w:p>
     <w:p>
@@ -4932,7 +5084,7 @@
         <w:drawing>
           <wp:inline xmlns:a="http://schemas.openxmlformats.org/drawingml/2006/main" xmlns:pic="http://schemas.openxmlformats.org/drawingml/2006/picture">
             <wp:extent cx="5486400" cy="4457700"/>
-            <wp:docPr id="26" name="Picture 26"/>
+            <wp:docPr id="27" name="Picture 27"/>
             <wp:cNvGraphicFramePr>
               <a:graphicFrameLocks noChangeAspect="1"/>
             </wp:cNvGraphicFramePr>
@@ -4940,11 +5092,11 @@
               <a:graphicData uri="http://schemas.openxmlformats.org/drawingml/2006/picture">
                 <pic:pic>
                   <pic:nvPicPr>
-                    <pic:cNvPr id="0" name="26-di-dong.png"/>
+                    <pic:cNvPr id="0" name="27-di-dong.png"/>
                     <pic:cNvPicPr/>
                   </pic:nvPicPr>
                   <pic:blipFill>
-                    <a:blip r:embed="rId34"/>
+                    <a:blip r:embed="rId35"/>
                     <a:stretch>
                       <a:fillRect/>
                     </a:stretch>
@@ -4972,7 +5124,7 @@
           <w:b w:val="0"/>
           <w:i/>
         </w:rPr>
-        <w:t>Hình 26 – Danh sách và chi tiết yêu cầu báo giá trên điện thoại</w:t>
+        <w:t>Hình 27 – Danh sách và chi tiết yêu cầu báo giá trên điện thoại</w:t>
       </w:r>
     </w:p>
     <w:p>
@@ -5058,7 +5210,7 @@
         <w:drawing>
           <wp:inline xmlns:a="http://schemas.openxmlformats.org/drawingml/2006/main" xmlns:pic="http://schemas.openxmlformats.org/drawingml/2006/picture">
             <wp:extent cx="5486400" cy="1772529"/>
-            <wp:docPr id="27" name="Picture 27"/>
+            <wp:docPr id="28" name="Picture 28"/>
             <wp:cNvGraphicFramePr>
               <a:graphicFrameLocks noChangeAspect="1"/>
             </wp:cNvGraphicFramePr>
@@ -5066,11 +5218,11 @@
               <a:graphicData uri="http://schemas.openxmlformats.org/drawingml/2006/picture">
                 <pic:pic>
                   <pic:nvPicPr>
-                    <pic:cNvPr id="0" name="27-desk-hang-viec.png"/>
+                    <pic:cNvPr id="0" name="28-desk-hang-viec.png"/>
                     <pic:cNvPicPr/>
                   </pic:nvPicPr>
                   <pic:blipFill>
-                    <a:blip r:embed="rId35"/>
+                    <a:blip r:embed="rId36"/>
                     <a:stretch>
                       <a:fillRect/>
                     </a:stretch>
@@ -5098,7 +5250,7 @@
           <w:b w:val="0"/>
           <w:i/>
         </w:rPr>
-        <w:t>Hình 27 – Lối tắt "Yêu cầu báo giá" kèm số việc đang chờ</w:t>
+        <w:t>Hình 28 – Lối tắt "Yêu cầu báo giá" kèm số việc đang chờ</w:t>
       </w:r>
     </w:p>
     <w:p>
@@ -5132,7 +5284,7 @@
         <w:drawing>
           <wp:inline xmlns:a="http://schemas.openxmlformats.org/drawingml/2006/main" xmlns:pic="http://schemas.openxmlformats.org/drawingml/2006/picture">
             <wp:extent cx="5486400" cy="1995055"/>
-            <wp:docPr id="28" name="Picture 28"/>
+            <wp:docPr id="29" name="Picture 29"/>
             <wp:cNvGraphicFramePr>
               <a:graphicFrameLocks noChangeAspect="1"/>
             </wp:cNvGraphicFramePr>
@@ -5140,11 +5292,11 @@
               <a:graphicData uri="http://schemas.openxmlformats.org/drawingml/2006/picture">
                 <pic:pic>
                   <pic:nvPicPr>
-                    <pic:cNvPr id="0" name="28-desk-danh-sach.png"/>
+                    <pic:cNvPr id="0" name="29-desk-danh-sach.png"/>
                     <pic:cNvPicPr/>
                   </pic:nvPicPr>
                   <pic:blipFill>
-                    <a:blip r:embed="rId36"/>
+                    <a:blip r:embed="rId37"/>
                     <a:stretch>
                       <a:fillRect/>
                     </a:stretch>
@@ -5172,7 +5324,7 @@
           <w:b w:val="0"/>
           <w:i/>
         </w:rPr>
-        <w:t>Hình 28 – Danh sách yêu cầu đang chờ Miyano báo giá</w:t>
+        <w:t>Hình 29 – Danh sách yêu cầu đang chờ Miyano báo giá</w:t>
       </w:r>
     </w:p>
     <w:p>
@@ -5212,7 +5364,7 @@
           <w:b w:val="0"/>
           <w:i w:val="0"/>
         </w:rPr>
-        <w:t xml:space="preserve"> có hai bảng:</w:t>
+        <w:t xml:space="preserve"> có:</w:t>
       </w:r>
     </w:p>
     <w:p>
@@ -5245,7 +5397,7 @@
           <w:b w:val="0"/>
           <w:i w:val="0"/>
         </w:rPr>
-        <w:t xml:space="preserve"> ghi "Báo giá".</w:t>
+        <w:t xml:space="preserve"> ghi "Báo giá". Yêu cầu chỉ gồm hàng khách gõ tay thì bảng này tạm có một dòng giữ chỗ "HANG-DAT-NGOAI: Hàng đặt ngoài (chờ Miyano khớp mã)"; dòng đó tự mất khi đã khớp mã.</w:t>
       </w:r>
     </w:p>
     <w:p>
@@ -5269,100 +5421,38 @@
     </w:p>
     <w:p>
       <w:pPr>
+        <w:pStyle w:val="ListBullet"/>
+      </w:pPr>
+      <w:r>
+        <w:rPr>
+          <w:b w:val="0"/>
+          <w:i w:val="0"/>
+        </w:rPr>
+        <w:t xml:space="preserve">Ngay dưới bảng đó, khối </w:t>
+      </w:r>
+      <w:r>
+        <w:rPr>
+          <w:b/>
+          <w:i w:val="0"/>
+        </w:rPr>
+        <w:t>Hàng chưa có mã — thông tin khách khai</w:t>
+      </w:r>
+      <w:r>
+        <w:rPr>
+          <w:b w:val="0"/>
+          <w:i w:val="0"/>
+        </w:rPr>
+        <w:t>: ảnh nhãn hộp, mô tả nhận dạng, model, hãng, nước sản xuất, quy cách mà khách đã khai. Trên Đơn bán hàng có hàng khách gõ tay, khối này cũng nằm ở đúng chỗ đó.</w:t>
+      </w:r>
+    </w:p>
+    <w:p>
+      <w:pPr>
         <w:jc w:val="center"/>
       </w:pPr>
       <w:r>
         <w:drawing>
           <wp:inline xmlns:a="http://schemas.openxmlformats.org/drawingml/2006/main" xmlns:pic="http://schemas.openxmlformats.org/drawingml/2006/picture">
-            <wp:extent cx="5486400" cy="3740727"/>
-            <wp:docPr id="29" name="Picture 29"/>
-            <wp:cNvGraphicFramePr>
-              <a:graphicFrameLocks noChangeAspect="1"/>
-            </wp:cNvGraphicFramePr>
-            <a:graphic>
-              <a:graphicData uri="http://schemas.openxmlformats.org/drawingml/2006/picture">
-                <pic:pic>
-                  <pic:nvPicPr>
-                    <pic:cNvPr id="0" name="29-desk-form-bao-gia.png"/>
-                    <pic:cNvPicPr/>
-                  </pic:nvPicPr>
-                  <pic:blipFill>
-                    <a:blip r:embed="rId37"/>
-                    <a:stretch>
-                      <a:fillRect/>
-                    </a:stretch>
-                  </pic:blipFill>
-                  <pic:spPr>
-                    <a:xfrm>
-                      <a:off x="0" y="0"/>
-                      <a:ext cx="5486400" cy="3740727"/>
-                    </a:xfrm>
-                    <a:prstGeom prst="rect"/>
-                  </pic:spPr>
-                </pic:pic>
-              </a:graphicData>
-            </a:graphic>
-          </wp:inline>
-        </w:drawing>
-      </w:r>
-    </w:p>
-    <w:p>
-      <w:pPr>
-        <w:jc w:val="center"/>
-      </w:pPr>
-      <w:r>
-        <w:rPr>
-          <w:b w:val="0"/>
-          <w:i/>
-        </w:rPr>
-        <w:t>Hình 29 – Yêu cầu báo giá trên Desk: bảng "Các mặt hàng" và bảng "Hàng khách gõ tay (chưa có mã)"</w:t>
-      </w:r>
-    </w:p>
-    <w:p>
-      <w:r>
-        <w:rPr>
-          <w:b w:val="0"/>
-          <w:i w:val="0"/>
-        </w:rPr>
-        <w:t xml:space="preserve">Ảnh nhãn hộp, mô tả nhận dạng, model, hãng, nước sản xuất, quy cách mà khách đã khai nằm ở tab </w:t>
-      </w:r>
-      <w:r>
-        <w:rPr>
-          <w:b/>
-          <w:i w:val="0"/>
-        </w:rPr>
-        <w:t>Liên kết</w:t>
-      </w:r>
-      <w:r>
-        <w:rPr>
-          <w:b w:val="0"/>
-          <w:i w:val="0"/>
-        </w:rPr>
-        <w:t xml:space="preserve">, khối </w:t>
-      </w:r>
-      <w:r>
-        <w:rPr>
-          <w:b/>
-          <w:i w:val="0"/>
-        </w:rPr>
-        <w:t>Hàng chưa có mã — thông tin khách khai</w:t>
-      </w:r>
-      <w:r>
-        <w:rPr>
-          <w:b w:val="0"/>
-          <w:i w:val="0"/>
-        </w:rPr>
-        <w:t>.</w:t>
-      </w:r>
-    </w:p>
-    <w:p>
-      <w:pPr>
-        <w:jc w:val="center"/>
-      </w:pPr>
-      <w:r>
-        <w:drawing>
-          <wp:inline xmlns:a="http://schemas.openxmlformats.org/drawingml/2006/main" xmlns:pic="http://schemas.openxmlformats.org/drawingml/2006/picture">
-            <wp:extent cx="5486400" cy="2576946"/>
+            <wp:extent cx="5486400" cy="3192087"/>
             <wp:docPr id="30" name="Picture 30"/>
             <wp:cNvGraphicFramePr>
               <a:graphicFrameLocks noChangeAspect="1"/>
@@ -5371,7 +5461,7 @@
               <a:graphicData uri="http://schemas.openxmlformats.org/drawingml/2006/picture">
                 <pic:pic>
                   <pic:nvPicPr>
-                    <pic:cNvPr id="0" name="30-desk-thong-tin-khach-khai.png"/>
+                    <pic:cNvPr id="0" name="30-desk-khoi-khach-khai.png"/>
                     <pic:cNvPicPr/>
                   </pic:nvPicPr>
                   <pic:blipFill>
@@ -5383,7 +5473,7 @@
                   <pic:spPr>
                     <a:xfrm>
                       <a:off x="0" y="0"/>
-                      <a:ext cx="5486400" cy="2576946"/>
+                      <a:ext cx="5486400" cy="3192087"/>
                     </a:xfrm>
                     <a:prstGeom prst="rect"/>
                   </pic:spPr>
@@ -5403,7 +5493,7 @@
           <w:b w:val="0"/>
           <w:i/>
         </w:rPr>
-        <w:t>Hình 30 – Tab "Liên kết": khối "Hàng chưa có mã — thông tin khách khai"</w:t>
+        <w:t>Hình 30 – Yêu cầu báo giá trên Desk: bảng "Các mặt hàng", bảng "Hàng khách gõ tay (chưa có mã)" và khối thông tin khách khai ngay bên dưới</w:t>
       </w:r>
     </w:p>
     <w:p>
@@ -6070,7 +6160,7 @@
                 <w:b w:val="0"/>
                 <w:i w:val="0"/>
               </w:rPr>
-              <w:t>Dòng giữ chỗ kỹ thuật (có khi yêu cầu chỉ gồm hàng gõ tay; tự mất khi đã khớp hết mã)</w:t>
+              <w:t>Dòng giữ chỗ "HANG-DAT-NGOAI" (có khi yêu cầu chỉ gồm hàng gõ tay; tự mất khi đã khớp mã)</w:t>
             </w:r>
           </w:p>
         </w:tc>
@@ -6085,7 +6175,7 @@
                 <w:b w:val="0"/>
                 <w:i w:val="0"/>
               </w:rPr>
-              <w:t>"Chưa gửi khách được — còn dòng giữ chỗ kỹ thuật …"</w:t>
+              <w:t>"Chưa gửi khách được — còn dòng giữ chỗ kỹ thuật HANG-DAT-NGOAI."</w:t>
             </w:r>
           </w:p>
         </w:tc>
@@ -6252,65 +6342,6 @@
     </w:p>
     <w:p>
       <w:pPr>
-        <w:pStyle w:val="Heading2"/>
-      </w:pPr>
-      <w:r>
-        <w:t>B5. "Thu hồi để sửa"</w:t>
-      </w:r>
-    </w:p>
-    <w:p>
-      <w:r>
-        <w:rPr>
-          <w:b w:val="0"/>
-          <w:i w:val="0"/>
-        </w:rPr>
-        <w:t xml:space="preserve">Đã gửi mà phát hiện sai giá: bấm </w:t>
-      </w:r>
-      <w:r>
-        <w:rPr>
-          <w:b/>
-          <w:i w:val="0"/>
-        </w:rPr>
-        <w:t>Các hành động → Thu hồi để sửa</w:t>
-      </w:r>
-      <w:r>
-        <w:rPr>
-          <w:b w:val="0"/>
-          <w:i w:val="0"/>
-        </w:rPr>
-        <w:t xml:space="preserve">. Yêu cầu quay về </w:t>
-      </w:r>
-      <w:r>
-        <w:rPr>
-          <w:b/>
-          <w:i w:val="0"/>
-        </w:rPr>
-        <w:t>Chờ Miyano báo giá</w:t>
-      </w:r>
-      <w:r>
-        <w:rPr>
-          <w:b w:val="0"/>
-          <w:i w:val="0"/>
-        </w:rPr>
-        <w:t xml:space="preserve">, hạn hiệu lực bị xoá, khách không còn thấy giá. Sửa xong bấm </w:t>
-      </w:r>
-      <w:r>
-        <w:rPr>
-          <w:b/>
-          <w:i w:val="0"/>
-        </w:rPr>
-        <w:t>Gửi khách duyệt</w:t>
-      </w:r>
-      <w:r>
-        <w:rPr>
-          <w:b w:val="0"/>
-          <w:i w:val="0"/>
-        </w:rPr>
-        <w:t xml:space="preserve"> lại; báo giá nhận hạn hiệu lực mới.</w:t>
-      </w:r>
-    </w:p>
-    <w:p>
-      <w:pPr>
         <w:jc w:val="center"/>
       </w:pPr>
       <w:r>
@@ -6325,7 +6356,7 @@
               <a:graphicData uri="http://schemas.openxmlformats.org/drawingml/2006/picture">
                 <pic:pic>
                   <pic:nvPicPr>
-                    <pic:cNvPr id="0" name="38-desk-thu-hoi-de-sua.png"/>
+                    <pic:cNvPr id="0" name="38-desk-chan-giu-cho.png"/>
                     <pic:cNvPicPr/>
                   </pic:nvPicPr>
                   <pic:blipFill>
@@ -6357,7 +6388,7 @@
           <w:b w:val="0"/>
           <w:i/>
         </w:rPr>
-        <w:t>Hình 38 – Ở "Chờ khách đồng ý" chỉ có một hành động: "Thu hồi để sửa"</w:t>
+        <w:t>Hình 38 – Bị chặn: yêu cầu chỉ có hàng gõ tay, chưa khớp mã nên còn dòng giữ chỗ</w:t>
       </w:r>
     </w:p>
     <w:p>
@@ -6365,7 +6396,7 @@
         <w:pStyle w:val="Heading2"/>
       </w:pPr>
       <w:r>
-        <w:t>B6. Khách sửa số lượng thì làm gì</w:t>
+        <w:t>B5. "Thu hồi để sửa"</w:t>
       </w:r>
     </w:p>
     <w:p>
@@ -6374,7 +6405,49 @@
           <w:b w:val="0"/>
           <w:i w:val="0"/>
         </w:rPr>
-        <w:t>Nhân viên phụ trách nhận thông báo ở biểu tượng chuông: "Portal - Khách sửa số lượng báo giá: …".</w:t>
+        <w:t xml:space="preserve">Đã gửi mà phát hiện sai giá: bấm </w:t>
+      </w:r>
+      <w:r>
+        <w:rPr>
+          <w:b/>
+          <w:i w:val="0"/>
+        </w:rPr>
+        <w:t>Các hành động → Thu hồi để sửa</w:t>
+      </w:r>
+      <w:r>
+        <w:rPr>
+          <w:b w:val="0"/>
+          <w:i w:val="0"/>
+        </w:rPr>
+        <w:t xml:space="preserve">. Yêu cầu quay về </w:t>
+      </w:r>
+      <w:r>
+        <w:rPr>
+          <w:b/>
+          <w:i w:val="0"/>
+        </w:rPr>
+        <w:t>Chờ Miyano báo giá</w:t>
+      </w:r>
+      <w:r>
+        <w:rPr>
+          <w:b w:val="0"/>
+          <w:i w:val="0"/>
+        </w:rPr>
+        <w:t xml:space="preserve">, hạn hiệu lực bị xoá, khách không còn thấy giá. Sửa xong bấm </w:t>
+      </w:r>
+      <w:r>
+        <w:rPr>
+          <w:b/>
+          <w:i w:val="0"/>
+        </w:rPr>
+        <w:t>Gửi khách duyệt</w:t>
+      </w:r>
+      <w:r>
+        <w:rPr>
+          <w:b w:val="0"/>
+          <w:i w:val="0"/>
+        </w:rPr>
+        <w:t xml:space="preserve"> lại; báo giá nhận hạn hiệu lực mới.</w:t>
       </w:r>
     </w:p>
     <w:p>
@@ -6384,7 +6457,7 @@
       <w:r>
         <w:drawing>
           <wp:inline xmlns:a="http://schemas.openxmlformats.org/drawingml/2006/main" xmlns:pic="http://schemas.openxmlformats.org/drawingml/2006/picture">
-            <wp:extent cx="5486400" cy="3113903"/>
+            <wp:extent cx="5486400" cy="1588168"/>
             <wp:docPr id="39" name="Picture 39"/>
             <wp:cNvGraphicFramePr>
               <a:graphicFrameLocks noChangeAspect="1"/>
@@ -6393,11 +6466,79 @@
               <a:graphicData uri="http://schemas.openxmlformats.org/drawingml/2006/picture">
                 <pic:pic>
                   <pic:nvPicPr>
-                    <pic:cNvPr id="0" name="39-desk-thong-bao-khach-sua.png"/>
+                    <pic:cNvPr id="0" name="39-desk-thu-hoi-de-sua.png"/>
                     <pic:cNvPicPr/>
                   </pic:nvPicPr>
                   <pic:blipFill>
                     <a:blip r:embed="rId47"/>
+                    <a:stretch>
+                      <a:fillRect/>
+                    </a:stretch>
+                  </pic:blipFill>
+                  <pic:spPr>
+                    <a:xfrm>
+                      <a:off x="0" y="0"/>
+                      <a:ext cx="5486400" cy="1588168"/>
+                    </a:xfrm>
+                    <a:prstGeom prst="rect"/>
+                  </pic:spPr>
+                </pic:pic>
+              </a:graphicData>
+            </a:graphic>
+          </wp:inline>
+        </w:drawing>
+      </w:r>
+    </w:p>
+    <w:p>
+      <w:pPr>
+        <w:jc w:val="center"/>
+      </w:pPr>
+      <w:r>
+        <w:rPr>
+          <w:b w:val="0"/>
+          <w:i/>
+        </w:rPr>
+        <w:t>Hình 39 – Ở "Chờ khách đồng ý" chỉ có một hành động: "Thu hồi để sửa"</w:t>
+      </w:r>
+    </w:p>
+    <w:p>
+      <w:pPr>
+        <w:pStyle w:val="Heading2"/>
+      </w:pPr>
+      <w:r>
+        <w:t>B6. Khách sửa số lượng thì làm gì</w:t>
+      </w:r>
+    </w:p>
+    <w:p>
+      <w:r>
+        <w:rPr>
+          <w:b w:val="0"/>
+          <w:i w:val="0"/>
+        </w:rPr>
+        <w:t>Nhân viên phụ trách nhận thông báo ở biểu tượng chuông: "Portal - Khách sửa số lượng báo giá: …".</w:t>
+      </w:r>
+    </w:p>
+    <w:p>
+      <w:pPr>
+        <w:jc w:val="center"/>
+      </w:pPr>
+      <w:r>
+        <w:drawing>
+          <wp:inline xmlns:a="http://schemas.openxmlformats.org/drawingml/2006/main" xmlns:pic="http://schemas.openxmlformats.org/drawingml/2006/picture">
+            <wp:extent cx="5486400" cy="3113903"/>
+            <wp:docPr id="40" name="Picture 40"/>
+            <wp:cNvGraphicFramePr>
+              <a:graphicFrameLocks noChangeAspect="1"/>
+            </wp:cNvGraphicFramePr>
+            <a:graphic>
+              <a:graphicData uri="http://schemas.openxmlformats.org/drawingml/2006/picture">
+                <pic:pic>
+                  <pic:nvPicPr>
+                    <pic:cNvPr id="0" name="40-desk-thong-bao-khach-sua.png"/>
+                    <pic:cNvPicPr/>
+                  </pic:nvPicPr>
+                  <pic:blipFill>
+                    <a:blip r:embed="rId48"/>
                     <a:stretch>
                       <a:fillRect/>
                     </a:stretch>
@@ -6425,7 +6566,7 @@
           <w:b w:val="0"/>
           <w:i/>
         </w:rPr>
-        <w:t>Hình 39 – Thông báo khách sửa số lượng</w:t>
+        <w:t>Hình 40 – Thông báo khách sửa số lượng</w:t>
       </w:r>
     </w:p>
     <w:p>
@@ -6553,7 +6694,7 @@
         <w:drawing>
           <wp:inline xmlns:a="http://schemas.openxmlformats.org/drawingml/2006/main" xmlns:pic="http://schemas.openxmlformats.org/drawingml/2006/picture">
             <wp:extent cx="5486400" cy="3740727"/>
-            <wp:docPr id="40" name="Picture 40"/>
+            <wp:docPr id="41" name="Picture 41"/>
             <wp:cNvGraphicFramePr>
               <a:graphicFrameLocks noChangeAspect="1"/>
             </wp:cNvGraphicFramePr>
@@ -6561,11 +6702,11 @@
               <a:graphicData uri="http://schemas.openxmlformats.org/drawingml/2006/picture">
                 <pic:pic>
                   <pic:nvPicPr>
-                    <pic:cNvPr id="0" name="40-desk-gia-giu-nguyen.png"/>
+                    <pic:cNvPr id="0" name="41-desk-gia-giu-nguyen.png"/>
                     <pic:cNvPicPr/>
                   </pic:nvPicPr>
                   <pic:blipFill>
-                    <a:blip r:embed="rId48"/>
+                    <a:blip r:embed="rId49"/>
                     <a:stretch>
                       <a:fillRect/>
                     </a:stretch>
@@ -6593,7 +6734,7 @@
           <w:b w:val="0"/>
           <w:i/>
         </w:rPr>
-        <w:t>Hình 40 – Sau khi khách sửa: số lượng 30, đơn giá vẫn 32.000, "Hiệu lực đến" trống</w:t>
+        <w:t>Hình 41 – Sau khi khách sửa: số lượng 30, đơn giá vẫn 32.000, "Hiệu lực đến" trống</w:t>
       </w:r>
     </w:p>
     <w:p>
@@ -6622,7 +6763,7 @@
           <w:b w:val="0"/>
           <w:i w:val="0"/>
         </w:rPr>
-        <w:t xml:space="preserve">Mở khối </w:t>
+        <w:t xml:space="preserve">Kéo xuống mục </w:t>
       </w:r>
       <w:r>
         <w:rPr>
@@ -6636,7 +6777,7 @@
           <w:b w:val="0"/>
           <w:i w:val="0"/>
         </w:rPr>
-        <w:t xml:space="preserve"> trên biểu mẫu (bấm vào tiêu đề khối để bung ra).</w:t>
+        <w:t xml:space="preserve"> trên biểu mẫu.</w:t>
       </w:r>
     </w:p>
     <w:p>
@@ -6648,7 +6789,7 @@
           <w:b w:val="0"/>
           <w:i w:val="0"/>
         </w:rPr>
-        <w:t xml:space="preserve">Điền </w:t>
+        <w:t xml:space="preserve">Điền ô </w:t>
       </w:r>
       <w:r>
         <w:rPr>
@@ -6713,7 +6854,7 @@
         <w:drawing>
           <wp:inline xmlns:a="http://schemas.openxmlformats.org/drawingml/2006/main" xmlns:pic="http://schemas.openxmlformats.org/drawingml/2006/picture">
             <wp:extent cx="5486400" cy="3184486"/>
-            <wp:docPr id="41" name="Picture 41"/>
+            <wp:docPr id="42" name="Picture 42"/>
             <wp:cNvGraphicFramePr>
               <a:graphicFrameLocks noChangeAspect="1"/>
             </wp:cNvGraphicFramePr>
@@ -6721,11 +6862,11 @@
               <a:graphicData uri="http://schemas.openxmlformats.org/drawingml/2006/picture">
                 <pic:pic>
                   <pic:nvPicPr>
-                    <pic:cNvPr id="0" name="41-desk-ly-do-tu-choi.png"/>
+                    <pic:cNvPr id="0" name="42-desk-ly-do-tu-choi.png"/>
                     <pic:cNvPicPr/>
                   </pic:nvPicPr>
                   <pic:blipFill>
-                    <a:blip r:embed="rId49"/>
+                    <a:blip r:embed="rId50"/>
                     <a:stretch>
                       <a:fillRect/>
                     </a:stretch>
@@ -6753,7 +6894,7 @@
           <w:b w:val="0"/>
           <w:i/>
         </w:rPr>
-        <w:t>Hình 41 – Ô "Lý do từ chối" trong khối "Cổng khách hàng"</w:t>
+        <w:t>Hình 42 – Ô "Lý do từ chối" trong mục "Cổng khách hàng"</w:t>
       </w:r>
     </w:p>
     <w:p>
@@ -6762,7 +6903,7 @@
           <w:b w:val="0"/>
           <w:i w:val="0"/>
         </w:rPr>
-        <w:t>Chưa có lý do thì hệ thống chặn:</w:t>
+        <w:t>Chưa có lý do thì hệ thống chặn và chỉ luôn chỗ phải điền: "Phải nhập lý do từ chối (tối thiểu 10 ký tự) trước khi chuyển trạng thái. Nhập ở mục «Cổng khách hàng» → ô «Lý do từ chối» rồi lưu, sau đó bấm lại «Từ chối»."</w:t>
       </w:r>
     </w:p>
     <w:p>
@@ -6773,7 +6914,7 @@
         <w:drawing>
           <wp:inline xmlns:a="http://schemas.openxmlformats.org/drawingml/2006/main" xmlns:pic="http://schemas.openxmlformats.org/drawingml/2006/picture">
             <wp:extent cx="5486400" cy="1588168"/>
-            <wp:docPr id="42" name="Picture 42"/>
+            <wp:docPr id="43" name="Picture 43"/>
             <wp:cNvGraphicFramePr>
               <a:graphicFrameLocks noChangeAspect="1"/>
             </wp:cNvGraphicFramePr>
@@ -6781,11 +6922,11 @@
               <a:graphicData uri="http://schemas.openxmlformats.org/drawingml/2006/picture">
                 <pic:pic>
                   <pic:nvPicPr>
-                    <pic:cNvPr id="0" name="42-desk-chan-thieu-ly-do.png"/>
+                    <pic:cNvPr id="0" name="43-desk-chan-thieu-ly-do.png"/>
                     <pic:cNvPicPr/>
                   </pic:nvPicPr>
                   <pic:blipFill>
-                    <a:blip r:embed="rId50"/>
+                    <a:blip r:embed="rId51"/>
                     <a:stretch>
                       <a:fillRect/>
                     </a:stretch>
@@ -6813,7 +6954,7 @@
           <w:b w:val="0"/>
           <w:i/>
         </w:rPr>
-        <w:t>Hình 42 – Từ chối khi chưa có lý do</w:t>
+        <w:t>Hình 43 – Từ chối khi chưa có lý do: thông báo chỉ chỗ điền</w:t>
       </w:r>
     </w:p>
     <w:p>
@@ -6847,7 +6988,7 @@
         <w:drawing>
           <wp:inline xmlns:a="http://schemas.openxmlformats.org/drawingml/2006/main" xmlns:pic="http://schemas.openxmlformats.org/drawingml/2006/picture">
             <wp:extent cx="5486400" cy="1371600"/>
-            <wp:docPr id="43" name="Picture 43"/>
+            <wp:docPr id="44" name="Picture 44"/>
             <wp:cNvGraphicFramePr>
               <a:graphicFrameLocks noChangeAspect="1"/>
             </wp:cNvGraphicFramePr>
@@ -6855,11 +6996,11 @@
               <a:graphicData uri="http://schemas.openxmlformats.org/drawingml/2006/picture">
                 <pic:pic>
                   <pic:nvPicPr>
-                    <pic:cNvPr id="0" name="43-desk-miyano-tu-choi.png"/>
+                    <pic:cNvPr id="0" name="44-desk-miyano-tu-choi.png"/>
                     <pic:cNvPicPr/>
                   </pic:nvPicPr>
                   <pic:blipFill>
-                    <a:blip r:embed="rId51"/>
+                    <a:blip r:embed="rId52"/>
                     <a:stretch>
                       <a:fillRect/>
                     </a:stretch>
@@ -6887,7 +7028,7 @@
           <w:b w:val="0"/>
           <w:i/>
         </w:rPr>
-        <w:t>Hình 43 – Trạng thái "Miyano từ chối"</w:t>
+        <w:t>Hình 44 – Trạng thái "Miyano từ chối"</w:t>
       </w:r>
     </w:p>
     <w:p>
@@ -6994,7 +7135,7 @@
         <w:drawing>
           <wp:inline xmlns:a="http://schemas.openxmlformats.org/drawingml/2006/main" xmlns:pic="http://schemas.openxmlformats.org/drawingml/2006/picture">
             <wp:extent cx="5486400" cy="1588168"/>
-            <wp:docPr id="44" name="Picture 44"/>
+            <wp:docPr id="45" name="Picture 45"/>
             <wp:cNvGraphicFramePr>
               <a:graphicFrameLocks noChangeAspect="1"/>
             </wp:cNvGraphicFramePr>
@@ -7002,11 +7143,11 @@
               <a:graphicData uri="http://schemas.openxmlformats.org/drawingml/2006/picture">
                 <pic:pic>
                   <pic:nvPicPr>
-                    <pic:cNvPr id="0" name="44-desk-mo-lai.png"/>
+                    <pic:cNvPr id="0" name="45-desk-mo-lai.png"/>
                     <pic:cNvPicPr/>
                   </pic:nvPicPr>
                   <pic:blipFill>
-                    <a:blip r:embed="rId52"/>
+                    <a:blip r:embed="rId53"/>
                     <a:stretch>
                       <a:fillRect/>
                     </a:stretch>
@@ -7034,7 +7175,7 @@
           <w:b w:val="0"/>
           <w:i/>
         </w:rPr>
-        <w:t>Hình 44 – Báo giá hết hạn: hành động duy nhất là "Mở lại"</w:t>
+        <w:t>Hình 45 – Báo giá hết hạn: hành động duy nhất là "Mở lại"</w:t>
       </w:r>
     </w:p>
     <w:p>
@@ -7114,7 +7255,7 @@
           <w:b w:val="0"/>
           <w:i w:val="0"/>
         </w:rPr>
-        <w:t>.</w:t>
+        <w:t>. Đầu biểu mẫu có dòng nền xanh: "Khách đã đồng ý trên cổng — hệ thống đã sinh đơn hàng …. Không tạo đơn thứ hai từ báo giá này." Bấm mã đơn trong dòng đó để mở đơn.</w:t>
       </w:r>
     </w:p>
     <w:p>
@@ -7125,7 +7266,7 @@
         <w:drawing>
           <wp:inline xmlns:a="http://schemas.openxmlformats.org/drawingml/2006/main" xmlns:pic="http://schemas.openxmlformats.org/drawingml/2006/picture">
             <wp:extent cx="5486400" cy="1371600"/>
-            <wp:docPr id="45" name="Picture 45"/>
+            <wp:docPr id="46" name="Picture 46"/>
             <wp:cNvGraphicFramePr>
               <a:graphicFrameLocks noChangeAspect="1"/>
             </wp:cNvGraphicFramePr>
@@ -7133,11 +7274,11 @@
               <a:graphicData uri="http://schemas.openxmlformats.org/drawingml/2006/picture">
                 <pic:pic>
                   <pic:nvPicPr>
-                    <pic:cNvPr id="0" name="45-desk-bao-gia-da-dong-y.png"/>
+                    <pic:cNvPr id="0" name="46-desk-bao-gia-da-dong-y.png"/>
                     <pic:cNvPicPr/>
                   </pic:nvPicPr>
                   <pic:blipFill>
-                    <a:blip r:embed="rId53"/>
+                    <a:blip r:embed="rId54"/>
                     <a:stretch>
                       <a:fillRect/>
                     </a:stretch>
@@ -7165,7 +7306,7 @@
           <w:b w:val="0"/>
           <w:i/>
         </w:rPr>
-        <w:t>Hình 45 – Báo giá ở "Khách đã đồng ý"</w:t>
+        <w:t>Hình 46 – Báo giá ở "Khách đã đồng ý": dòng dẫn tới đơn đã sinh; không còn nút tạo đơn</w:t>
       </w:r>
     </w:p>
     <w:p>
@@ -7258,7 +7399,7 @@
         <w:drawing>
           <wp:inline xmlns:a="http://schemas.openxmlformats.org/drawingml/2006/main" xmlns:pic="http://schemas.openxmlformats.org/drawingml/2006/picture">
             <wp:extent cx="5486400" cy="3740727"/>
-            <wp:docPr id="46" name="Picture 46"/>
+            <wp:docPr id="47" name="Picture 47"/>
             <wp:cNvGraphicFramePr>
               <a:graphicFrameLocks noChangeAspect="1"/>
             </wp:cNvGraphicFramePr>
@@ -7266,11 +7407,11 @@
               <a:graphicData uri="http://schemas.openxmlformats.org/drawingml/2006/picture">
                 <pic:pic>
                   <pic:nvPicPr>
-                    <pic:cNvPr id="0" name="46-desk-don-theo-bao-gia.png"/>
+                    <pic:cNvPr id="0" name="47-desk-don-theo-bao-gia.png"/>
                     <pic:cNvPicPr/>
                   </pic:nvPicPr>
                   <pic:blipFill>
-                    <a:blip r:embed="rId54"/>
+                    <a:blip r:embed="rId55"/>
                     <a:stretch>
                       <a:fillRect/>
                     </a:stretch>
@@ -7298,7 +7439,7 @@
           <w:b w:val="0"/>
           <w:i/>
         </w:rPr>
-        <w:t>Hình 46 – Đơn "Theo báo giá" ở "Chờ Miyano xác nhận"</w:t>
+        <w:t>Hình 47 – Đơn "Theo báo giá" ở "Chờ Miyano xác nhận"</w:t>
       </w:r>
     </w:p>
     <w:p>
@@ -7349,7 +7490,7 @@
         <w:drawing>
           <wp:inline xmlns:a="http://schemas.openxmlformats.org/drawingml/2006/main" xmlns:pic="http://schemas.openxmlformats.org/drawingml/2006/picture">
             <wp:extent cx="5486400" cy="2869413"/>
-            <wp:docPr id="47" name="Picture 47"/>
+            <wp:docPr id="48" name="Picture 48"/>
             <wp:cNvGraphicFramePr>
               <a:graphicFrameLocks noChangeAspect="1"/>
             </wp:cNvGraphicFramePr>
@@ -7357,11 +7498,11 @@
               <a:graphicData uri="http://schemas.openxmlformats.org/drawingml/2006/picture">
                 <pic:pic>
                   <pic:nvPicPr>
-                    <pic:cNvPr id="0" name="47-desk-ghi-gia.png"/>
+                    <pic:cNvPr id="0" name="48-desk-ghi-gia.png"/>
                     <pic:cNvPicPr/>
                   </pic:nvPicPr>
                   <pic:blipFill>
-                    <a:blip r:embed="rId55"/>
+                    <a:blip r:embed="rId56"/>
                     <a:stretch>
                       <a:fillRect/>
                     </a:stretch>
@@ -7389,7 +7530,7 @@
           <w:b w:val="0"/>
           <w:i/>
         </w:rPr>
-        <w:t>Hình 47 – Phần Hoạt động của đơn: "[Portal] Ghi giá khách đã đồng ý vào …"</w:t>
+        <w:t>Hình 48 – Phần Hoạt động của đơn: "[Portal] Ghi giá khách đã đồng ý vào …"</w:t>
       </w:r>
     </w:p>
     <w:p>
@@ -7446,49 +7587,101 @@
       </w:r>
     </w:p>
     <w:p>
-      <w:pPr>
-        <w:pStyle w:val="IntenseQuote"/>
+      <w:r>
+        <w:rPr>
+          <w:b/>
+          <w:i w:val="0"/>
+        </w:rPr>
+        <w:t>Báo giá của cổng đã đồng ý được hệ thống giữ chặt với đơn của nó:</w:t>
+      </w:r>
+    </w:p>
+    <w:p>
+      <w:pPr>
+        <w:pStyle w:val="ListBullet"/>
       </w:pPr>
       <w:r>
         <w:rPr>
           <w:b w:val="0"/>
           <w:i w:val="0"/>
         </w:rPr>
-        <w:t>Trên báo giá đã đồng ý, Desk vẫn hiện các nút có sẵn của phần mềm (</w:t>
+        <w:t xml:space="preserve">Trên báo giá không còn nút tạo Đơn bán hàng và nút </w:t>
       </w:r>
       <w:r>
         <w:rPr>
           <w:b/>
           <w:i w:val="0"/>
         </w:rPr>
-        <w:t>Tạo</w:t>
+        <w:t>Đặt là đã mất</w:t>
       </w:r>
       <w:r>
         <w:rPr>
           <w:b w:val="0"/>
           <w:i w:val="0"/>
         </w:rPr>
-        <w:t xml:space="preserve">, </w:t>
+        <w:t xml:space="preserve">; chỉ còn </w:t>
       </w:r>
       <w:r>
         <w:rPr>
           <w:b/>
           <w:i w:val="0"/>
         </w:rPr>
-        <w:t>Đặt là đã mất</w:t>
+        <w:t>Hủy</w:t>
       </w:r>
       <w:r>
         <w:rPr>
           <w:b w:val="0"/>
           <w:i w:val="0"/>
         </w:rPr>
-        <w:t xml:space="preserve">, </w:t>
+        <w:t>.</w:t>
+      </w:r>
+    </w:p>
+    <w:p>
+      <w:pPr>
+        <w:pStyle w:val="ListBullet"/>
+      </w:pPr>
+      <w:r>
+        <w:rPr>
+          <w:b w:val="0"/>
+          <w:i w:val="0"/>
+        </w:rPr>
+        <w:t xml:space="preserve">Không lập được đơn thứ hai từ báo giá của cổng, kể cả bằng </w:t>
       </w:r>
       <w:r>
         <w:rPr>
           <w:b/>
           <w:i w:val="0"/>
         </w:rPr>
+        <w:t>Lấy mặt hàng từ → Báo giá</w:t>
+      </w:r>
+      <w:r>
+        <w:rPr>
+          <w:b w:val="0"/>
+          <w:i w:val="0"/>
+        </w:rPr>
+        <w:t xml:space="preserve"> trên một đơn nháp. Hệ thống báo: "Báo giá của cổng đã có đơn hàng … — không tạo đơn thứ hai."</w:t>
+      </w:r>
+    </w:p>
+    <w:p>
+      <w:pPr>
+        <w:pStyle w:val="ListBullet"/>
+      </w:pPr>
+      <w:r>
+        <w:rPr>
+          <w:b w:val="0"/>
+          <w:i w:val="0"/>
+        </w:rPr>
+        <w:t>Báo giá của cổng chưa được khách đồng ý thì không lập đơn tay từ nó được: "Đơn hàng của báo giá … chỉ sinh ra khi khách đồng ý trên cổng — không tạo tay từ báo giá của cổng."</w:t>
+      </w:r>
+    </w:p>
+    <w:p>
+      <w:pPr>
+        <w:pStyle w:val="ListBullet"/>
+      </w:pPr>
+      <w:r>
+        <w:rPr>
+          <w:b/>
+          <w:i w:val="0"/>
+        </w:rPr>
         <w:t>Hủy</w:t>
       </w:r>
       <w:r>
@@ -7496,35 +7689,7 @@
           <w:b w:val="0"/>
           <w:i w:val="0"/>
         </w:rPr>
-        <w:t xml:space="preserve">). Đơn hàng đã được tạo tự động — </w:t>
-      </w:r>
-      <w:r>
-        <w:rPr>
-          <w:b/>
-          <w:i w:val="0"/>
-        </w:rPr>
-        <w:t>không</w:t>
-      </w:r>
-      <w:r>
-        <w:rPr>
-          <w:b w:val="0"/>
-          <w:i w:val="0"/>
-        </w:rPr>
-        <w:t xml:space="preserve"> dùng </w:t>
-      </w:r>
-      <w:r>
-        <w:rPr>
-          <w:b/>
-          <w:i w:val="0"/>
-        </w:rPr>
-        <w:t>Tạo</w:t>
-      </w:r>
-      <w:r>
-        <w:rPr>
-          <w:b w:val="0"/>
-          <w:i w:val="0"/>
-        </w:rPr>
-        <w:t xml:space="preserve"> để lập thêm đơn thứ hai.</w:t>
+        <w:t xml:space="preserve"> báo giá chỉ làm được khi đơn của nó không còn hiệu lực. Đơn còn sống thì hệ thống chặn: "Báo giá … của cổng khách hàng đã sinh đơn hàng … và đơn đó còn hiệu lực. Trước khi huỷ báo giá, phải huỷ đơn hàng … (nếu đã xác nhận) hoặc bấm «Từ chối» trên đơn (nếu còn chờ xác nhận)."</w:t>
       </w:r>
     </w:p>
     <w:p>
@@ -9482,21 +9647,7 @@
                 <w:b w:val="0"/>
                 <w:i w:val="0"/>
               </w:rPr>
-              <w:t xml:space="preserve">Mở đơn sinh từ báo giá trên cổng, bảng mặt hàng </w:t>
-            </w:r>
-            <w:r>
-              <w:rPr>
-                <w:b/>
-                <w:i w:val="0"/>
-              </w:rPr>
-              <w:t>thiếu</w:t>
-            </w:r>
-            <w:r>
-              <w:rPr>
-                <w:b w:val="0"/>
-                <w:i w:val="0"/>
-              </w:rPr>
-              <w:t xml:space="preserve"> mặt hàng vốn là hàng tự khai</w:t>
+              <w:t>Trong đơn sinh từ báo giá, một mặt hàng có "—" ở cột SL DUYỆT (có khi cả SL ĐỀ XUẤT)</w:t>
             </w:r>
           </w:p>
         </w:tc>
@@ -9511,21 +9662,7 @@
                 <w:b w:val="0"/>
                 <w:i w:val="0"/>
               </w:rPr>
-              <w:t xml:space="preserve">Hạn chế đã biết của bản này: màn chi tiết đơn chưa liệt kê hàng tự khai đã được khớp mã. Giá trị đơn trong danh sách vẫn đủ. Xem đầy đủ bằng </w:t>
-            </w:r>
-            <w:r>
-              <w:rPr>
-                <w:b/>
-                <w:i w:val="0"/>
-              </w:rPr>
-              <w:t>Xem yêu cầu báo giá … →</w:t>
-            </w:r>
-            <w:r>
-              <w:rPr>
-                <w:b w:val="0"/>
-                <w:i w:val="0"/>
-              </w:rPr>
-              <w:t xml:space="preserve"> hoặc bản PDF báo giá</w:t>
+              <w:t>Đó là mặt hàng không có mã lúc gửi (hàng tự khai, Miyano khớp mã khi báo giá) nên không có dòng tương ứng trên phiếu để duyệt. Cột SL ĐẶT, đơn giá và thành tiền vẫn đúng theo báo giá</w:t>
             </w:r>
           </w:p>
         </w:tc>
@@ -9571,7 +9708,7 @@
                 <w:b w:val="0"/>
                 <w:i w:val="0"/>
               </w:rPr>
-              <w:t>Tài khoản cần vai kinh doanh. Nếu đã có vai mà vẫn không thấy, nhờ quản trị hệ thống làm mới bộ nhớ đệm rồi tải lại trang</w:t>
+              <w:t>Tài khoản cần vai kinh doanh. Đã có vai mà vẫn không thấy thì báo quản trị hệ thống (xem Phần F)</w:t>
             </w:r>
           </w:p>
         </w:tc>
@@ -9620,7 +9757,7 @@
                 <w:b w:val="0"/>
                 <w:i w:val="0"/>
               </w:rPr>
-              <w:t>(Desk) "Phải nhập lý do từ chối (tối thiểu 10 ký tự) trước khi chuyển trạng thái."</w:t>
+              <w:t>(Desk) "Phải nhập lý do từ chối (tối thiểu 10 ký tự) trước khi chuyển trạng thái. Nhập ở mục «Cổng khách hàng» → ô «Lý do từ chối» rồi lưu, sau đó bấm lại «Từ chối»."</w:t>
             </w:r>
           </w:p>
         </w:tc>
@@ -9635,7 +9772,7 @@
                 <w:b w:val="0"/>
                 <w:i w:val="0"/>
               </w:rPr>
-              <w:t xml:space="preserve">Điền </w:t>
+              <w:t xml:space="preserve">Làm đúng như thông báo: điền </w:t>
             </w:r>
             <w:r>
               <w:rPr>
@@ -9649,7 +9786,7 @@
                 <w:b w:val="0"/>
                 <w:i w:val="0"/>
               </w:rPr>
-              <w:t xml:space="preserve"> trong khối </w:t>
+              <w:t xml:space="preserve"> trong mục </w:t>
             </w:r>
             <w:r>
               <w:rPr>
@@ -9692,6 +9829,84 @@
                 <w:i w:val="0"/>
               </w:rPr>
               <w:t xml:space="preserve"> lại</w:t>
+            </w:r>
+          </w:p>
+        </w:tc>
+      </w:tr>
+      <w:tr>
+        <w:tc>
+          <w:tcPr>
+            <w:tcW w:type="dxa" w:w="4320"/>
+          </w:tcPr>
+          <w:p>
+            <w:r/>
+            <w:r>
+              <w:rPr>
+                <w:b w:val="0"/>
+                <w:i w:val="0"/>
+              </w:rPr>
+              <w:t>(Desk) "Báo giá của cổng đã có đơn hàng … — không tạo đơn thứ hai."</w:t>
+            </w:r>
+          </w:p>
+        </w:tc>
+        <w:tc>
+          <w:tcPr>
+            <w:tcW w:type="dxa" w:w="4320"/>
+          </w:tcPr>
+          <w:p>
+            <w:r/>
+            <w:r>
+              <w:rPr>
+                <w:b w:val="0"/>
+                <w:i w:val="0"/>
+              </w:rPr>
+              <w:t>Đơn đã được hệ thống sinh khi khách đồng ý. Mở đơn đó (dòng nền xanh đầu báo giá) thay vì lập đơn mới</w:t>
+            </w:r>
+          </w:p>
+        </w:tc>
+      </w:tr>
+      <w:tr>
+        <w:tc>
+          <w:tcPr>
+            <w:tcW w:type="dxa" w:w="4320"/>
+          </w:tcPr>
+          <w:p>
+            <w:r/>
+            <w:r>
+              <w:rPr>
+                <w:b w:val="0"/>
+                <w:i w:val="0"/>
+              </w:rPr>
+              <w:t>(Desk) Không hủy được báo giá, báo "… đã sinh đơn hàng … và đơn đó còn hiệu lực …"</w:t>
+            </w:r>
+          </w:p>
+        </w:tc>
+        <w:tc>
+          <w:tcPr>
+            <w:tcW w:type="dxa" w:w="4320"/>
+          </w:tcPr>
+          <w:p>
+            <w:r/>
+            <w:r>
+              <w:rPr>
+                <w:b w:val="0"/>
+                <w:i w:val="0"/>
+              </w:rPr>
+              <w:t xml:space="preserve">Xử lý đơn trước: hủy đơn (nếu đã xác nhận) hoặc </w:t>
+            </w:r>
+            <w:r>
+              <w:rPr>
+                <w:b/>
+                <w:i w:val="0"/>
+              </w:rPr>
+              <w:t>Từ chối</w:t>
+            </w:r>
+            <w:r>
+              <w:rPr>
+                <w:b w:val="0"/>
+                <w:i w:val="0"/>
+              </w:rPr>
+              <w:t xml:space="preserve"> đơn (nếu còn chờ xác nhận), rồi mới hủy báo giá</w:t>
             </w:r>
           </w:p>
         </w:tc>
@@ -9765,7 +9980,7 @@
                 <w:b w:val="0"/>
                 <w:i w:val="0"/>
               </w:rPr>
-              <w:t>; chỉ email không được gửi. Báo quản trị hệ thống cấu hình email</w:t>
+              <w:t>; chỉ email không được gửi. Báo quản trị hệ thống (xem Phần F)</w:t>
             </w:r>
           </w:p>
         </w:tc>
@@ -9890,7 +10105,7 @@
         <w:drawing>
           <wp:inline xmlns:a="http://schemas.openxmlformats.org/drawingml/2006/main" xmlns:pic="http://schemas.openxmlformats.org/drawingml/2006/picture">
             <wp:extent cx="5486400" cy="1588168"/>
-            <wp:docPr id="48" name="Picture 48"/>
+            <wp:docPr id="49" name="Picture 49"/>
             <wp:cNvGraphicFramePr>
               <a:graphicFrameLocks noChangeAspect="1"/>
             </wp:cNvGraphicFramePr>
@@ -9898,11 +10113,11 @@
               <a:graphicData uri="http://schemas.openxmlformats.org/drawingml/2006/picture">
                 <pic:pic>
                   <pic:nvPicPr>
-                    <pic:cNvPr id="0" name="48-desk-thieu-email.png"/>
+                    <pic:cNvPr id="0" name="49-desk-thieu-email.png"/>
                     <pic:cNvPicPr/>
                   </pic:nvPicPr>
                   <pic:blipFill>
-                    <a:blip r:embed="rId56"/>
+                    <a:blip r:embed="rId57"/>
                     <a:stretch>
                       <a:fillRect/>
                     </a:stretch>
@@ -9930,7 +10145,7 @@
           <w:b w:val="0"/>
           <w:i/>
         </w:rPr>
-        <w:t>Hình 48 – Hộp báo thiếu cấu hình email sau khi bấm "Gửi khách duyệt": trạng thái vẫn chuyển, chỉ email không gửi được</w:t>
+        <w:t>Hình 49 – Hộp báo thiếu cấu hình email sau khi bấm "Gửi khách duyệt": trạng thái vẫn chuyển, chỉ email không gửi được</w:t>
       </w:r>
     </w:p>
     <w:p>
@@ -10179,6 +10394,148 @@
           <w:i w:val="0"/>
         </w:rPr>
         <w:t xml:space="preserve"> Cổng chỉ hiện báo giá bắt nguồn từ yêu cầu của chính bệnh viện.</w:t>
+      </w:r>
+    </w:p>
+    <w:p>
+      <w:pPr>
+        <w:jc w:val="center"/>
+      </w:pPr>
+      <w:r>
+        <w:t>────────────────────────────────────────────────────────────</w:t>
+      </w:r>
+    </w:p>
+    <w:p>
+      <w:pPr>
+        <w:pStyle w:val="Heading1"/>
+      </w:pPr>
+      <w:r>
+        <w:t>F — Ghi chú cho quản trị hệ thống của Miyano</w:t>
+      </w:r>
+    </w:p>
+    <w:p>
+      <w:r>
+        <w:rPr>
+          <w:b w:val="0"/>
+          <w:i w:val="0"/>
+        </w:rPr>
+        <w:t>Mỗi lần cập nhật hệ thống lên bản có chức năng này, quản trị viên làm đủ ba việc; thiếu một việc thì người dùng sẽ gặp các hiện tượng ở Phần D.</w:t>
+      </w:r>
+    </w:p>
+    <w:p>
+      <w:pPr>
+        <w:pStyle w:val="ListNumber"/>
+      </w:pPr>
+      <w:r>
+        <w:rPr>
+          <w:b/>
+          <w:i w:val="0"/>
+        </w:rPr>
+        <w:t>Chạy cập nhật cơ sở dữ liệu</w:t>
+      </w:r>
+      <w:r>
+        <w:rPr>
+          <w:b w:val="0"/>
+          <w:i w:val="0"/>
+        </w:rPr>
+        <w:t xml:space="preserve"> của hệ thống. Bước này tạo các trạng thái, hành động, mẫu in báo giá và thông báo mà chức năng cần.</w:t>
+      </w:r>
+    </w:p>
+    <w:p>
+      <w:pPr>
+        <w:pStyle w:val="ListNumber"/>
+      </w:pPr>
+      <w:r>
+        <w:rPr>
+          <w:b/>
+          <w:i w:val="0"/>
+        </w:rPr>
+        <w:t>Khởi động lại các dịch vụ</w:t>
+      </w:r>
+      <w:r>
+        <w:rPr>
+          <w:b w:val="0"/>
+          <w:i w:val="0"/>
+        </w:rPr>
+        <w:t xml:space="preserve"> của hệ thống để bản mới có hiệu lực.</w:t>
+      </w:r>
+    </w:p>
+    <w:p>
+      <w:pPr>
+        <w:pStyle w:val="ListNumber"/>
+      </w:pPr>
+      <w:r>
+        <w:rPr>
+          <w:b/>
+          <w:i w:val="0"/>
+        </w:rPr>
+        <w:t>Dựng lại giao diện và xoá bộ nhớ đệm.</w:t>
+      </w:r>
+      <w:r>
+        <w:rPr>
+          <w:b w:val="0"/>
+          <w:i w:val="0"/>
+        </w:rPr>
+        <w:t xml:space="preserve"> Chưa làm bước này thì nhân viên có thể không thấy lối tắt </w:t>
+      </w:r>
+      <w:r>
+        <w:rPr>
+          <w:b/>
+          <w:i w:val="0"/>
+        </w:rPr>
+        <w:t>Yêu cầu báo giá</w:t>
+      </w:r>
+      <w:r>
+        <w:rPr>
+          <w:b w:val="0"/>
+          <w:i w:val="0"/>
+        </w:rPr>
+        <w:t xml:space="preserve"> trong "Kho khách hàng" dù đã đủ quyền, hoặc biểu mẫu Báo giá còn hiện theo bản cũ. Sau đó nhân viên tải lại trang.</w:t>
+      </w:r>
+    </w:p>
+    <w:p>
+      <w:r>
+        <w:rPr>
+          <w:b/>
+          <w:i w:val="0"/>
+        </w:rPr>
+        <w:t>Email.</w:t>
+      </w:r>
+      <w:r>
+        <w:rPr>
+          <w:b w:val="0"/>
+          <w:i w:val="0"/>
+        </w:rPr>
+        <w:t xml:space="preserve"> Email báo giá, email hết hạn và email từ chối chỉ gửi được khi hệ thống đã có </w:t>
+      </w:r>
+      <w:r>
+        <w:rPr>
+          <w:b/>
+          <w:i w:val="0"/>
+        </w:rPr>
+        <w:t>tài khoản email gửi đi mặc định</w:t>
+      </w:r>
+      <w:r>
+        <w:rPr>
+          <w:b w:val="0"/>
+          <w:i w:val="0"/>
+        </w:rPr>
+        <w:t>. Chưa cấu hình thì nhân viên thấy hộp "Vui lòng cấu hình Tài khoản Email đi mặc định từ Công cụ &gt; Tài khoản Email" sau mỗi lần gửi báo giá hoặc từ chối; thông báo trên cổng vẫn tới khách, riêng email thì không.</w:t>
+      </w:r>
+    </w:p>
+    <w:p>
+      <w:r>
+        <w:rPr>
+          <w:b/>
+          <w:i w:val="0"/>
+        </w:rPr>
+        <w:t>Việc hằng ngày tự chạy.</w:t>
+      </w:r>
+      <w:r>
+        <w:rPr>
+          <w:b w:val="0"/>
+          <w:i w:val="0"/>
+        </w:rPr>
+        <w:t xml:space="preserve"> Mỗi ngày hệ thống tự đóng các báo giá quá hạn hiệu lực. Số ngày hiệu lực đặt trong phần cài đặt của cổng khách hàng (đang là 7 ngày).</w:t>
       </w:r>
     </w:p>
     <w:sectPr>

</xml_diff>